<commit_message>
Deploying to gh-pages from @ Morrison-Lab/sds@3e2740ad2ad7ba39c2cbfe326402dcd69923d51b 🚀
</commit_message>
<xml_diff>
--- a/bootstrap-handout.docx
+++ b/bootstrap-handout.docx
@@ -15,7 +15,7 @@
         <w:pStyle w:val="Date"/>
       </w:pPr>
       <w:r>
-        <w:t xml:space="preserve">Last modified: 2026-10-26 03:19:48 (PDT)</w:t>
+        <w:t xml:space="preserve">Last modified: 2026-10-26 09:42:48 (PDT)</w:t>
       </w:r>
     </w:p>
     <w:p>
@@ -9073,17 +9073,57 @@
     <w:bookmarkEnd w:id="49"/>
     <w:bookmarkEnd w:id="50"/>
     <w:bookmarkEnd w:id="51"/>
-    <w:bookmarkStart w:id="73" w:name="references"/>
+    <w:bookmarkStart w:id="52" w:name="sec-bootstrap-reading"/>
     <w:p>
       <w:pPr>
         <w:pStyle w:val="Heading2"/>
       </w:pPr>
       <w:r>
+        <w:t xml:space="preserve">3 Further reading</w:t>
+      </w:r>
+    </w:p>
+    <w:p>
+      <w:pPr>
+        <w:pStyle w:val="Compact"/>
+        <w:numPr>
+          <w:ilvl w:val="0"/>
+          <w:numId w:val="1004"/>
+        </w:numPr>
+      </w:pPr>
+      <w:r>
+        <w:t xml:space="preserve">Chapter 24 of Lange’s textbook</w:t>
+      </w:r>
+      <w:r>
+        <w:t xml:space="preserve"> </w:t>
+      </w:r>
+      <w:r>
+        <w:t xml:space="preserve">[12]</w:t>
+      </w:r>
+      <w:r>
+        <w:t xml:space="preserve"> </w:t>
+      </w:r>
+      <w:r>
+        <w:t xml:space="preserve">covers permutation tests and the bootstrap,</w:t>
+      </w:r>
+      <w:r>
+        <w:t xml:space="preserve"> </w:t>
+      </w:r>
+      <w:r>
+        <w:t xml:space="preserve">with an emphasis on computation.</w:t>
+      </w:r>
+    </w:p>
+    <w:bookmarkEnd w:id="52"/>
+    <w:bookmarkStart w:id="76" w:name="references"/>
+    <w:p>
+      <w:pPr>
+        <w:pStyle w:val="Heading2"/>
+      </w:pPr>
+      <w:r>
         <w:t xml:space="preserve">References</w:t>
       </w:r>
     </w:p>
-    <w:bookmarkStart w:id="72" w:name="refs"/>
-    <w:bookmarkStart w:id="53" w:name="ref-vittinghoff2e"/>
+    <w:bookmarkStart w:id="75" w:name="refs"/>
+    <w:bookmarkStart w:id="54" w:name="ref-vittinghoff2e"/>
     <w:p>
       <w:pPr>
         <w:pStyle w:val="Bibliography"/>
@@ -9116,7 +9156,7 @@
       <w:r>
         <w:t xml:space="preserve"> </w:t>
       </w:r>
-      <w:hyperlink r:id="rId52">
+      <w:hyperlink r:id="rId53">
         <w:r>
           <w:rPr>
             <w:rStyle w:val="Hyperlink"/>
@@ -9128,8 +9168,8 @@
         <w:t xml:space="preserve">.</w:t>
       </w:r>
     </w:p>
-    <w:bookmarkEnd w:id="53"/>
-    <w:bookmarkStart w:id="55" w:name="ref-efron1979bootstrap"/>
+    <w:bookmarkEnd w:id="54"/>
+    <w:bookmarkStart w:id="56" w:name="ref-efron1979bootstrap"/>
     <w:p>
       <w:pPr>
         <w:pStyle w:val="Bibliography"/>
@@ -9168,7 +9208,7 @@
       <w:r>
         <w:t xml:space="preserve"> </w:t>
       </w:r>
-      <w:hyperlink r:id="rId54">
+      <w:hyperlink r:id="rId55">
         <w:r>
           <w:rPr>
             <w:rStyle w:val="Hyperlink"/>
@@ -9180,8 +9220,8 @@
         <w:t xml:space="preserve">.</w:t>
       </w:r>
     </w:p>
-    <w:bookmarkEnd w:id="55"/>
-    <w:bookmarkStart w:id="57" w:name="ref-efron1993introduction"/>
+    <w:bookmarkEnd w:id="56"/>
+    <w:bookmarkStart w:id="58" w:name="ref-efron1993introduction"/>
     <w:p>
       <w:pPr>
         <w:pStyle w:val="Bibliography"/>
@@ -9214,7 +9254,7 @@
       <w:r>
         <w:t xml:space="preserve"> </w:t>
       </w:r>
-      <w:hyperlink r:id="rId56">
+      <w:hyperlink r:id="rId57">
         <w:r>
           <w:rPr>
             <w:rStyle w:val="Hyperlink"/>
@@ -9226,8 +9266,8 @@
         <w:t xml:space="preserve">.</w:t>
       </w:r>
     </w:p>
-    <w:bookmarkEnd w:id="57"/>
-    <w:bookmarkStart w:id="59" w:name="ref-wikipedia_resampling_statistics"/>
+    <w:bookmarkEnd w:id="58"/>
+    <w:bookmarkStart w:id="60" w:name="ref-wikipedia_resampling_statistics"/>
     <w:p>
       <w:pPr>
         <w:pStyle w:val="Bibliography"/>
@@ -9274,7 +9314,7 @@
       <w:r>
         <w:t xml:space="preserve"> </w:t>
       </w:r>
-      <w:hyperlink r:id="rId58">
+      <w:hyperlink r:id="rId59">
         <w:r>
           <w:rPr>
             <w:rStyle w:val="Hyperlink"/>
@@ -9283,8 +9323,8 @@
         </w:r>
       </w:hyperlink>
     </w:p>
-    <w:bookmarkEnd w:id="59"/>
-    <w:bookmarkStart w:id="61" w:name="ref-wikipedia_bootstrapping_statistics"/>
+    <w:bookmarkEnd w:id="60"/>
+    <w:bookmarkStart w:id="62" w:name="ref-wikipedia_bootstrapping_statistics"/>
     <w:p>
       <w:pPr>
         <w:pStyle w:val="Bibliography"/>
@@ -9331,7 +9371,7 @@
       <w:r>
         <w:t xml:space="preserve"> </w:t>
       </w:r>
-      <w:hyperlink r:id="rId60">
+      <w:hyperlink r:id="rId61">
         <w:r>
           <w:rPr>
             <w:rStyle w:val="Hyperlink"/>
@@ -9340,8 +9380,8 @@
         </w:r>
       </w:hyperlink>
     </w:p>
-    <w:bookmarkEnd w:id="61"/>
-    <w:bookmarkStart w:id="63" w:name="ref-wikipedia_standard_error"/>
+    <w:bookmarkEnd w:id="62"/>
+    <w:bookmarkStart w:id="64" w:name="ref-wikipedia_standard_error"/>
     <w:p>
       <w:pPr>
         <w:pStyle w:val="Bibliography"/>
@@ -9388,7 +9428,7 @@
       <w:r>
         <w:t xml:space="preserve"> </w:t>
       </w:r>
-      <w:hyperlink r:id="rId62">
+      <w:hyperlink r:id="rId63">
         <w:r>
           <w:rPr>
             <w:rStyle w:val="Hyperlink"/>
@@ -9397,8 +9437,8 @@
         </w:r>
       </w:hyperlink>
     </w:p>
-    <w:bookmarkEnd w:id="63"/>
-    <w:bookmarkStart w:id="64" w:name="ref-hoggtanis2015"/>
+    <w:bookmarkEnd w:id="64"/>
+    <w:bookmarkStart w:id="65" w:name="ref-hoggtanis2015"/>
     <w:p>
       <w:pPr>
         <w:pStyle w:val="Bibliography"/>
@@ -9429,8 +9469,8 @@
         <w:t xml:space="preserve">, Tenth edition. Boston: Pearson, 2019.</w:t>
       </w:r>
     </w:p>
-    <w:bookmarkEnd w:id="64"/>
-    <w:bookmarkStart w:id="66" w:name="ref-CaseBerg01"/>
+    <w:bookmarkEnd w:id="65"/>
+    <w:bookmarkStart w:id="67" w:name="ref-CaseBerg01"/>
     <w:p>
       <w:pPr>
         <w:pStyle w:val="Bibliography"/>
@@ -9463,7 +9503,7 @@
       <w:r>
         <w:t xml:space="preserve"> </w:t>
       </w:r>
-      <w:hyperlink r:id="rId65">
+      <w:hyperlink r:id="rId66">
         <w:r>
           <w:rPr>
             <w:rStyle w:val="Hyperlink"/>
@@ -9472,8 +9512,8 @@
         </w:r>
       </w:hyperlink>
     </w:p>
-    <w:bookmarkEnd w:id="66"/>
-    <w:bookmarkStart w:id="67" w:name="ref-rice2007mathematical"/>
+    <w:bookmarkEnd w:id="67"/>
+    <w:bookmarkStart w:id="68" w:name="ref-rice2007mathematical"/>
     <w:p>
       <w:pPr>
         <w:pStyle w:val="Bibliography"/>
@@ -9504,8 +9544,8 @@
         <w:t xml:space="preserve">, 3rd ed. Belmont, CA: Cengage Learning, 2007.</w:t>
       </w:r>
     </w:p>
-    <w:bookmarkEnd w:id="67"/>
-    <w:bookmarkStart w:id="69" w:name="ref-wikipedia_confidence_interval"/>
+    <w:bookmarkEnd w:id="68"/>
+    <w:bookmarkStart w:id="70" w:name="ref-wikipedia_confidence_interval"/>
     <w:p>
       <w:pPr>
         <w:pStyle w:val="Bibliography"/>
@@ -9552,7 +9592,7 @@
       <w:r>
         <w:t xml:space="preserve"> </w:t>
       </w:r>
-      <w:hyperlink r:id="rId68">
+      <w:hyperlink r:id="rId69">
         <w:r>
           <w:rPr>
             <w:rStyle w:val="Hyperlink"/>
@@ -9561,8 +9601,8 @@
         </w:r>
       </w:hyperlink>
     </w:p>
-    <w:bookmarkEnd w:id="69"/>
-    <w:bookmarkStart w:id="71" w:name="ref-davison1997bootstrap"/>
+    <w:bookmarkEnd w:id="70"/>
+    <w:bookmarkStart w:id="72" w:name="ref-davison1997bootstrap"/>
     <w:p>
       <w:pPr>
         <w:pStyle w:val="Bibliography"/>
@@ -9595,7 +9635,7 @@
       <w:r>
         <w:t xml:space="preserve"> </w:t>
       </w:r>
-      <w:hyperlink r:id="rId70">
+      <w:hyperlink r:id="rId71">
         <w:r>
           <w:rPr>
             <w:rStyle w:val="Hyperlink"/>
@@ -9607,9 +9647,55 @@
         <w:t xml:space="preserve">.</w:t>
       </w:r>
     </w:p>
-    <w:bookmarkEnd w:id="71"/>
     <w:bookmarkEnd w:id="72"/>
-    <w:bookmarkEnd w:id="73"/>
+    <w:bookmarkStart w:id="74" w:name="ref-lange2010numerical"/>
+    <w:p>
+      <w:pPr>
+        <w:pStyle w:val="Bibliography"/>
+      </w:pPr>
+      <w:r>
+        <w:t xml:space="preserve">[12]</w:t>
+      </w:r>
+      <w:r>
+        <w:t xml:space="preserve"> </w:t>
+      </w:r>
+      <w:r>
+        <w:t xml:space="preserve">	</w:t>
+      </w:r>
+      <w:r>
+        <w:t xml:space="preserve">K. Lange,</w:t>
+      </w:r>
+      <w:r>
+        <w:t xml:space="preserve"> </w:t>
+      </w:r>
+      <w:r>
+        <w:rPr>
+          <w:i/>
+          <w:iCs/>
+        </w:rPr>
+        <w:t xml:space="preserve">Numerical analysis for statisticians</w:t>
+      </w:r>
+      <w:r>
+        <w:t xml:space="preserve">, 2nd ed. in Statistics and computing. Springer, 2010. doi:</w:t>
+      </w:r>
+      <w:r>
+        <w:t xml:space="preserve"> </w:t>
+      </w:r>
+      <w:hyperlink r:id="rId73">
+        <w:r>
+          <w:rPr>
+            <w:rStyle w:val="Hyperlink"/>
+          </w:rPr>
+          <w:t xml:space="preserve">10.1007/978-1-4419-5945-4</w:t>
+        </w:r>
+      </w:hyperlink>
+      <w:r>
+        <w:t xml:space="preserve">.</w:t>
+      </w:r>
+    </w:p>
+    <w:bookmarkEnd w:id="74"/>
+    <w:bookmarkEnd w:id="75"/>
+    <w:bookmarkEnd w:id="76"/>
     <w:sectPr>
       <w:footnotePr>
         <w:numRestart w:val="eachSect"/>
@@ -9833,6 +9919,9 @@
     <w:abstractNumId w:val="991"/>
   </w:num>
   <w:num w:numId="1003">
+    <w:abstractNumId w:val="991"/>
+  </w:num>
+  <w:num w:numId="1004">
     <w:abstractNumId w:val="991"/>
   </w:num>
 </w:numbering>

</xml_diff>